<commit_message>
Configured code to enable login and signup functionality
</commit_message>
<xml_diff>
--- a/VivaRepo_Project_Specification_v1.6.docx
+++ b/VivaRepo_Project_Specification_v1.6.docx
@@ -1,12 +1,13 @@
 
 <file path=word/document.xml><?xml version="1.0" encoding="utf-8"?>
-<w:document xmlns:wpc="http://schemas.microsoft.com/office/word/2010/wordprocessingCanvas" xmlns:cx="http://schemas.microsoft.com/office/drawing/2014/chartex" xmlns:cx1="http://schemas.microsoft.com/office/drawing/2015/9/8/chartex" xmlns:cx2="http://schemas.microsoft.com/office/drawing/2015/10/21/chartex" xmlns:cx3="http://schemas.microsoft.com/office/drawing/2016/5/9/chartex" xmlns:cx4="http://schemas.microsoft.com/office/drawing/2016/5/10/chartex" xmlns:cx5="http://schemas.microsoft.com/office/drawing/2016/5/11/chartex" xmlns:cx6="http://schemas.microsoft.com/office/drawing/2016/5/12/chartex" xmlns:cx7="http://schemas.microsoft.com/office/drawing/2016/5/13/chartex" xmlns:cx8="http://schemas.microsoft.com/office/drawing/2016/5/14/chartex" xmlns:mc="http://schemas.openxmlformats.org/markup-compatibility/2006" xmlns:aink="http://schemas.microsoft.com/office/drawing/2016/ink" xmlns:am3d="http://schemas.microsoft.com/office/drawing/2017/model3d" xmlns:o="urn:schemas-microsoft-com:office:office" xmlns:oel="http://schemas.microsoft.com/office/2019/extlst" xmlns:r="http://schemas.openxmlformats.org/officeDocument/2006/relationships" xmlns:m="http://schemas.openxmlformats.org/officeDocument/2006/math" xmlns:v="urn:schemas-microsoft-com:vml" xmlns:wp14="http://schemas.microsoft.com/office/word/2010/wordprocessingDrawing" xmlns:wp="http://schemas.openxmlformats.org/drawingml/2006/wordprocessingDrawing" xmlns:w10="urn:schemas-microsoft-com:office:word" xmlns:w="http://schemas.openxmlformats.org/wordprocessingml/2006/main" xmlns:w14="http://schemas.microsoft.com/office/word/2010/wordml" xmlns:w15="http://schemas.microsoft.com/office/word/2012/wordml" xmlns:w16cei="http://schemas.microsoft.com/office/word/2026/wordml/cei" xmlns:w16cex="http://schemas.microsoft.com/office/word/2018/wordml/cex" xmlns:w16cid="http://schemas.microsoft.com/office/word/2016/wordml/cid" xmlns:w16="http://schemas.microsoft.com/office/word/2018/wordml" xmlns:w16du="http://schemas.microsoft.com/office/word/2023/wordml/word16du" xmlns:w16sdtdh="http://schemas.microsoft.com/office/word/2020/wordml/sdtdatahash" xmlns:w16sdtfl="http://schemas.microsoft.com/office/word/2024/wordml/sdtformatlock" xmlns:w16se="http://schemas.microsoft.com/office/word/2015/wordml/symex" xmlns:wpg="http://schemas.microsoft.com/office/word/2010/wordprocessingGroup" xmlns:wpi="http://schemas.microsoft.com/office/word/2010/wordprocessingInk" xmlns:wne="http://schemas.microsoft.com/office/word/2006/wordml" xmlns:wps="http://schemas.microsoft.com/office/word/2010/wordprocessingShape" mc:Ignorable="w14 w15 w16se w16cid w16 w16cex w16sdtdh w16sdtfl w16du wp14">
+<w:document xmlns:wpc="http://schemas.microsoft.com/office/word/2010/wordprocessingCanvas" xmlns:cx="http://schemas.microsoft.com/office/drawing/2014/chartex" xmlns:cx1="http://schemas.microsoft.com/office/drawing/2015/9/8/chartex" xmlns:cx2="http://schemas.microsoft.com/office/drawing/2015/10/21/chartex" xmlns:cx3="http://schemas.microsoft.com/office/drawing/2016/5/9/chartex" xmlns:cx4="http://schemas.microsoft.com/office/drawing/2016/5/10/chartex" xmlns:cx5="http://schemas.microsoft.com/office/drawing/2016/5/11/chartex" xmlns:cx6="http://schemas.microsoft.com/office/drawing/2016/5/12/chartex" xmlns:cx7="http://schemas.microsoft.com/office/drawing/2016/5/13/chartex" xmlns:cx8="http://schemas.microsoft.com/office/drawing/2016/5/14/chartex" xmlns:mc="http://schemas.openxmlformats.org/markup-compatibility/2006" xmlns:aink="http://schemas.microsoft.com/office/drawing/2016/ink" xmlns:am3d="http://schemas.microsoft.com/office/drawing/2017/model3d" xmlns:o="urn:schemas-microsoft-com:office:office" xmlns:oel="http://schemas.microsoft.com/office/2019/extlst" xmlns:r="http://schemas.openxmlformats.org/officeDocument/2006/relationships" xmlns:m="http://schemas.openxmlformats.org/officeDocument/2006/math" xmlns:v="urn:schemas-microsoft-com:vml" xmlns:wp14="http://schemas.microsoft.com/office/word/2010/wordprocessingDrawing" xmlns:wp="http://schemas.openxmlformats.org/drawingml/2006/wordprocessingDrawing" xmlns:w10="urn:schemas-microsoft-com:office:word" xmlns:w="http://schemas.openxmlformats.org/wordprocessingml/2006/main" xmlns:w14="http://schemas.microsoft.com/office/word/2010/wordml" xmlns:w15="http://schemas.microsoft.com/office/word/2012/wordml" xmlns:w16cex="http://schemas.microsoft.com/office/word/2018/wordml/cex" xmlns:w16cid="http://schemas.microsoft.com/office/word/2016/wordml/cid" xmlns:w16="http://schemas.microsoft.com/office/word/2018/wordml" xmlns:w16du="http://schemas.microsoft.com/office/word/2023/wordml/word16du" xmlns:w16sdtdh="http://schemas.microsoft.com/office/word/2020/wordml/sdtdatahash" xmlns:w16sdtfl="http://schemas.microsoft.com/office/word/2024/wordml/sdtformatlock" xmlns:w16se="http://schemas.microsoft.com/office/word/2015/wordml/symex" xmlns:wpg="http://schemas.microsoft.com/office/word/2010/wordprocessingGroup" xmlns:wpi="http://schemas.microsoft.com/office/word/2010/wordprocessingInk" xmlns:wne="http://schemas.microsoft.com/office/word/2006/wordml" xmlns:wps="http://schemas.microsoft.com/office/word/2010/wordprocessingShape" mc:Ignorable="w14 w15 w16se w16cid w16 w16cex w16sdtdh w16sdtfl w16du wp14">
   <w:body>
     <w:p>
       <w:pPr>
         <w:spacing w:before="1080"/>
         <w:jc w:val="center"/>
       </w:pPr>
+      <w:proofErr w:type="spellStart"/>
       <w:r>
         <w:rPr>
           <w:rFonts w:ascii="Aptos Display" w:hAnsi="Aptos Display"/>
@@ -16,6 +17,7 @@
         </w:rPr>
         <w:t>VivaRepo</w:t>
       </w:r>
+      <w:proofErr w:type="spellEnd"/>
     </w:p>
     <w:p>
       <w:pPr>
@@ -27,7 +29,7 @@
           <w:color w:val="444444"/>
           <w:sz w:val="32"/>
         </w:rPr>
-        <w:t>Pain Point and Project Specification</w:t>
+        <w:t>Project Specification</w:t>
       </w:r>
     </w:p>
     <w:p>
@@ -83,8 +85,13 @@
             <w:pPr>
               <w:spacing w:after="0"/>
             </w:pPr>
-            <w:r>
-              <w:t>VivaRepo helps computer science students and early-career job seekers convert AI-assisted project completion into demonstrated programming mastery. It analyzes what a project uses, tests what the developer can independently explain and do, identifies mastery gaps, and generates targeted practice.</w:t>
+            <w:proofErr w:type="spellStart"/>
+            <w:r>
+              <w:t>VivaRepo</w:t>
+            </w:r>
+            <w:proofErr w:type="spellEnd"/>
+            <w:r>
+              <w:t xml:space="preserve"> helps computer science students and early-career job seekers convert AI-assisted project completion into demonstrated programming mastery. It analyzes what a project uses, tests what the developer can independently explain and do, identifies mastery gaps, and generates targeted practice.</w:t>
             </w:r>
           </w:p>
         </w:tc>
@@ -123,19 +130,40 @@
       <w:pPr>
         <w:spacing w:after="120" w:line="259" w:lineRule="auto"/>
       </w:pPr>
-      <w:r>
-        <w:t>VivaRepo addresses that gap. The application is implemented entirely in Python, while the projects it accepts may contain source files written in multiple programming languages. It treats a completed repository as evidence of what the student has encountered, not as proof of what the student has mastered. It maps code to relevant computer science and software engineering concepts, generates language-aware project-specific assessments, measures independent performance, and highlights the difference between project sophistication and demonstrated mastery.</w:t>
+      <w:proofErr w:type="spellStart"/>
+      <w:r>
+        <w:t>VivaRepo</w:t>
+      </w:r>
+      <w:proofErr w:type="spellEnd"/>
+      <w:r>
+        <w:t xml:space="preserve"> addresses that gap. The application is implemented entirely in Python, while the projects it accepts may contain source files written in multiple programming languages. It treats a completed repository as evidence of what the student has encountered, not as proof of what the student has mastered. It maps code to relevant computer science and software engineering concepts, generates language-aware project-specific assessments, measures independent performance, and highlights the difference between project sophistication and demonstrated mastery.</w:t>
       </w:r>
     </w:p>
     <w:p>
+      <w:proofErr w:type="gramStart"/>
       <w:r>
         <w:rPr>
           <w:b/>
         </w:rPr>
-        <w:t xml:space="preserve">Implementation language and input languages are different requirements. </w:t>
-      </w:r>
-      <w:r>
-        <w:t>Python is the sole programming language used to build VivaRepo. Python, Java, JavaScript, and TypeScript are initial supported input languages: their files are data analyzed by the Python application, not additional languages used to implement it.</w:t>
+        <w:t>Implementation</w:t>
+      </w:r>
+      <w:proofErr w:type="gramEnd"/>
+      <w:r>
+        <w:rPr>
+          <w:b/>
+        </w:rPr>
+        <w:t xml:space="preserve"> language and input languages are different requirements. </w:t>
+      </w:r>
+      <w:r>
+        <w:t xml:space="preserve">Python is the sole programming language used to build </w:t>
+      </w:r>
+      <w:proofErr w:type="spellStart"/>
+      <w:r>
+        <w:t>VivaRepo</w:t>
+      </w:r>
+      <w:proofErr w:type="spellEnd"/>
+      <w:r>
+        <w:t>. Python, Java, JavaScript, and TypeScript are initial supported input languages: their files are data analyzed by the Python application, not additional languages used to implement it.</w:t>
       </w:r>
     </w:p>
     <w:p>
@@ -262,7 +290,15 @@
         <w:spacing w:after="120" w:line="259" w:lineRule="auto"/>
       </w:pPr>
       <w:r>
-        <w:t>Traditional interview-preparation platforms usually ask learners to solve generic problems. Traditional course platforms usually assess concepts from a predefined curriculum. VivaRepo instead begins with the learner's own project and asks a different question: what knowledge should the developer be able to demonstrate if they claim this project as their own work?</w:t>
+        <w:t xml:space="preserve">Traditional interview-preparation platforms usually ask learners to solve generic problems. Traditional course platforms usually assess concepts from a predefined curriculum. </w:t>
+      </w:r>
+      <w:proofErr w:type="spellStart"/>
+      <w:r>
+        <w:t>VivaRepo</w:t>
+      </w:r>
+      <w:proofErr w:type="spellEnd"/>
+      <w:r>
+        <w:t xml:space="preserve"> instead begins with the learner's own project and asks a different question: what knowledge should the developer be able to demonstrate if they claim this project as their own work?</w:t>
       </w:r>
     </w:p>
     <w:tbl>
@@ -307,7 +343,15 @@
               <w:spacing w:after="0"/>
             </w:pPr>
             <w:r>
-              <w:t>A developer can possess a sophisticated repository without possessing equally sophisticated independent mastery. VivaRepo is designed to measure and reduce that gap.</w:t>
+              <w:t xml:space="preserve">A developer can possess a sophisticated repository without possessing equally sophisticated independent mastery. </w:t>
+            </w:r>
+            <w:proofErr w:type="spellStart"/>
+            <w:r>
+              <w:t>VivaRepo</w:t>
+            </w:r>
+            <w:proofErr w:type="spellEnd"/>
+            <w:r>
+              <w:t xml:space="preserve"> is designed to measure and reduce that gap.</w:t>
             </w:r>
           </w:p>
         </w:tc>
@@ -322,8 +366,13 @@
       </w:r>
     </w:p>
     <w:p>
-      <w:r>
-        <w:t>VivaRepo is grounded in an emerging body of evidence showing that AI-assisted coding can improve access and productivity while also creating a risk that successful output is mistaken for durable programming mastery. The research below motivates the product design, but it does not establish that AI use is inherently harmful. The recurring finding is that outcomes depend heavily on how learners use AI and whether they continue to practice independent reasoning, debugging, code reading, and implementation. [1-6]</w:t>
+      <w:proofErr w:type="spellStart"/>
+      <w:r>
+        <w:t>VivaRepo</w:t>
+      </w:r>
+      <w:proofErr w:type="spellEnd"/>
+      <w:r>
+        <w:t xml:space="preserve"> is grounded in an emerging body of evidence showing that AI-assisted coding can improve access and productivity while also creating a risk that successful output is mistaken for durable programming mastery. The research below motivates the product design, but it does not establish that AI use is inherently harmful. The recurring finding is that outcomes depend heavily on how learners use AI and whether they continue to practice independent reasoning, debugging, code reading, and implementation. [1-6]</w:t>
       </w:r>
     </w:p>
     <w:p>
@@ -349,7 +398,15 @@
     </w:p>
     <w:p>
       <w:r>
-        <w:t>A 2026 randomized controlled study from Anthropic examined 52 mostly junior software developers learning a new Python library. Participants with AI assistance averaged 50% on a post-task mastery quiz compared with 67% for participants who coded without AI, a 17-percentage-point difference. The largest performance gap appeared in debugging questions. However, stronger outcomes among AI users were associated with behaviors such as asking conceptual questions, requesting explanations, and checking understanding rather than delegating the full task. The result directly motivates VivaRepo's emphasis on debugging, explanation, and independent follow-up practice. [2]</w:t>
+        <w:t xml:space="preserve">A 2026 randomized controlled study from Anthropic examined 52 mostly junior software developers learning a new Python library. Participants with AI assistance averaged 50% on a post-task mastery quiz compared with 67% for participants who coded without AI, a 17-percentage-point difference. The largest performance gap appeared in debugging questions. However, stronger outcomes among AI users were associated with behaviors such as asking conceptual questions, requesting explanations, and checking understanding rather than delegating the full task. The result directly motivates </w:t>
+      </w:r>
+      <w:proofErr w:type="spellStart"/>
+      <w:r>
+        <w:t>VivaRepo's</w:t>
+      </w:r>
+      <w:proofErr w:type="spellEnd"/>
+      <w:r>
+        <w:t xml:space="preserve"> emphasis on debugging, explanation, and independent follow-up practice. [2]</w:t>
       </w:r>
     </w:p>
     <w:p>
@@ -366,7 +423,23 @@
       </w:r>
       <w:r>
         <w:lastRenderedPageBreak/>
-        <w:t>that many eventually asked it to generate a complete solution. They also described a pattern in which students submitted generated code, encountered problems, and returned to the chatbot for another fix rather than investigating the underlying mistake. VivaRepo addresses this risk by making the student's own explanation and performance the object of assessment, not merely whether the final repository works. [3]</w:t>
+        <w:t xml:space="preserve">that many eventually </w:t>
+      </w:r>
+      <w:proofErr w:type="gramStart"/>
+      <w:r>
+        <w:t>asked</w:t>
+      </w:r>
+      <w:proofErr w:type="gramEnd"/>
+      <w:r>
+        <w:t xml:space="preserve"> it to generate a complete solution. They also described a pattern in which students submitted generated code, encountered problems, and returned to the chatbot for another fix rather than investigating the underlying mistake. </w:t>
+      </w:r>
+      <w:proofErr w:type="spellStart"/>
+      <w:r>
+        <w:t>VivaRepo</w:t>
+      </w:r>
+      <w:proofErr w:type="spellEnd"/>
+      <w:r>
+        <w:t xml:space="preserve"> addresses this risk by making the student's own explanation and performance the object of assessment, not merely whether the final repository works. [3]</w:t>
       </w:r>
     </w:p>
     <w:p>
@@ -404,8 +477,21 @@
       </w:r>
     </w:p>
     <w:p>
-      <w:r>
-        <w:t>HackerRank's 2025 Developer Skills Report, based on platform data and a survey of 13,732 developers, managers, recruiters, executives, and students, reported widespread AI use among developers and estimated that 29% of developers' code was AI-generated on average. At the same time, 66% of surveyed developers preferred practical coding challenges and 96% said problem-solving should matter more than memorization. Because this is an industry survey rather than an academic experiment, it should be interpreted as market evidence rather than causal research. It nevertheless reinforces VivaRepo's focus on authentic, project-grounded demonstrations of skill. [6]</w:t>
+      <w:proofErr w:type="spellStart"/>
+      <w:r>
+        <w:t>HackerRank's</w:t>
+      </w:r>
+      <w:proofErr w:type="spellEnd"/>
+      <w:r>
+        <w:t xml:space="preserve"> 2025 Developer Skills Report, based on platform data and a survey of 13,732 developers, managers, recruiters, executives, and students, reported widespread AI use among developers and estimated that 29% of developers' code was AI-generated on average. At the same time, 66% of surveyed developers preferred practical coding challenges and 96% said problem-solving should matter more than memorization. Because this is an industry survey rather than an academic experiment, it should be interpreted as market evidence rather than causal research. It nevertheless reinforces </w:t>
+      </w:r>
+      <w:proofErr w:type="spellStart"/>
+      <w:r>
+        <w:t>VivaRepo's</w:t>
+      </w:r>
+      <w:proofErr w:type="spellEnd"/>
+      <w:r>
+        <w:t xml:space="preserve"> focus on authentic, project-grounded demonstrations of skill. [6]</w:t>
       </w:r>
     </w:p>
     <w:p>
@@ -468,12 +554,21 @@
                 <w:bCs/>
               </w:rPr>
             </w:pPr>
+            <w:proofErr w:type="spellStart"/>
             <w:r>
               <w:rPr>
                 <w:b/>
                 <w:bCs/>
               </w:rPr>
-              <w:t>VivaRepo design implication</w:t>
+              <w:t>VivaRepo</w:t>
+            </w:r>
+            <w:proofErr w:type="spellEnd"/>
+            <w:r>
+              <w:rPr>
+                <w:b/>
+                <w:bCs/>
+              </w:rPr>
+              <w:t xml:space="preserve"> design implication</w:t>
             </w:r>
           </w:p>
         </w:tc>
@@ -676,7 +771,15 @@
         <w:spacing w:after="40" w:line="247" w:lineRule="auto"/>
       </w:pPr>
       <w:r>
-        <w:t>Recent graduates preparing for entry-level software engineering interviews.</w:t>
+        <w:t xml:space="preserve">Recent graduates </w:t>
+      </w:r>
+      <w:proofErr w:type="gramStart"/>
+      <w:r>
+        <w:t>preparing</w:t>
+      </w:r>
+      <w:proofErr w:type="gramEnd"/>
+      <w:r>
+        <w:t xml:space="preserve"> for entry-level software engineering interviews.</w:t>
       </w:r>
     </w:p>
     <w:p>
@@ -923,7 +1026,15 @@
           </w:tcPr>
           <w:p>
             <w:r>
-              <w:t>Emphasize explain, trace, debug, modify, and rebuild skills.</w:t>
+              <w:t xml:space="preserve">Emphasize </w:t>
+            </w:r>
+            <w:proofErr w:type="gramStart"/>
+            <w:r>
+              <w:t>explain</w:t>
+            </w:r>
+            <w:proofErr w:type="gramEnd"/>
+            <w:r>
+              <w:t>, trace, debug, modify, and rebuild skills.</w:t>
             </w:r>
           </w:p>
         </w:tc>
@@ -939,7 +1050,15 @@
           </w:tcPr>
           <w:p>
             <w:r>
-              <w:t>Replace LeetCode, a complete CS curriculum, or a university course.</w:t>
+              <w:t xml:space="preserve">Replace </w:t>
+            </w:r>
+            <w:proofErr w:type="spellStart"/>
+            <w:r>
+              <w:t>LeetCode</w:t>
+            </w:r>
+            <w:proofErr w:type="spellEnd"/>
+            <w:r>
+              <w:t>, a complete CS curriculum, or a university course.</w:t>
             </w:r>
           </w:p>
         </w:tc>
@@ -1040,7 +1159,15 @@
           </w:tcPr>
           <w:p>
             <w:r>
-              <w:t>Use Java, JavaScript, TypeScript, or another supported input language to implement VivaRepo.</w:t>
+              <w:t xml:space="preserve">Use Java, JavaScript, TypeScript, or another supported input language to implement </w:t>
+            </w:r>
+            <w:proofErr w:type="spellStart"/>
+            <w:r>
+              <w:t>VivaRepo</w:t>
+            </w:r>
+            <w:proofErr w:type="spellEnd"/>
+            <w:r>
+              <w:t>.</w:t>
             </w:r>
           </w:p>
         </w:tc>
@@ -1199,8 +1326,13 @@
             </w:tcMar>
           </w:tcPr>
           <w:p>
-            <w:r>
-              <w:t>VivaRepo routes each supported source file to a Python-based language adapter and extracts deterministic features such as modules or packages, classes, functions or methods, imports, calls, tests, dependencies, SQL, exceptions, and project structure.</w:t>
+            <w:proofErr w:type="spellStart"/>
+            <w:r>
+              <w:t>VivaRepo</w:t>
+            </w:r>
+            <w:proofErr w:type="spellEnd"/>
+            <w:r>
+              <w:t xml:space="preserve"> routes each supported source file to a Python-based language adapter and extracts deterministic features such as modules or packages, classes, functions or methods, imports, calls, tests, dependencies, SQL, exceptions, and project structure.</w:t>
             </w:r>
           </w:p>
         </w:tc>
@@ -1323,7 +1455,15 @@
           </w:tcPr>
           <w:p>
             <w:r>
-              <w:t>The student completes explain, trace, debug, modify, rebuild, and defend tasks. Some modes prohibit AI assistance.</w:t>
+              <w:t xml:space="preserve">The student completes </w:t>
+            </w:r>
+            <w:proofErr w:type="gramStart"/>
+            <w:r>
+              <w:t>explain</w:t>
+            </w:r>
+            <w:proofErr w:type="gramEnd"/>
+            <w:r>
+              <w:t>, trace, debug, modify, rebuild, and defend tasks. Some modes prohibit AI assistance.</w:t>
             </w:r>
           </w:p>
         </w:tc>
@@ -1404,8 +1544,13 @@
             </w:tcMar>
           </w:tcPr>
           <w:p>
-            <w:r>
-              <w:t>VivaRepo compares project exposure with demonstrated mastery and independence.</w:t>
+            <w:proofErr w:type="spellStart"/>
+            <w:r>
+              <w:t>VivaRepo</w:t>
+            </w:r>
+            <w:proofErr w:type="spellEnd"/>
+            <w:r>
+              <w:t xml:space="preserve"> compares project exposure with demonstrated mastery and independence.</w:t>
             </w:r>
           </w:p>
         </w:tc>
@@ -2890,7 +3035,15 @@
               <w:spacing w:after="0"/>
             </w:pPr>
             <w:r>
-              <w:t>A repository may show strong SQL exposure (91%) while the student demonstrates only moderate SQL mastery (54%). VivaRepo should flag SQL as a high-priority area and provide evidence showing where the gap came from, such as weak modification and rebuild performance.</w:t>
+              <w:t xml:space="preserve">A repository may show strong SQL exposure (91%) while the student demonstrates only moderate SQL mastery (54%). </w:t>
+            </w:r>
+            <w:proofErr w:type="spellStart"/>
+            <w:r>
+              <w:t>VivaRepo</w:t>
+            </w:r>
+            <w:proofErr w:type="spellEnd"/>
+            <w:r>
+              <w:t xml:space="preserve"> should flag SQL as a high-priority area and provide evidence showing where the gap came from, such as weak modification and rebuild performance.</w:t>
             </w:r>
           </w:p>
         </w:tc>
@@ -2910,7 +3063,15 @@
         <w:spacing w:after="120" w:line="259" w:lineRule="auto"/>
       </w:pPr>
       <w:r>
-        <w:t xml:space="preserve">The recommended implementation is a local-first Django web application built entirely in Python. Django provides URL routing, server-rendered templates, forms, persistence, migrations, sessions, security protections, and testing support, while project analysis adapters, OpenAI integration, and domain services </w:t>
+        <w:t xml:space="preserve">The recommended implementation is a </w:t>
+      </w:r>
+      <w:proofErr w:type="gramStart"/>
+      <w:r>
+        <w:t>local-first</w:t>
+      </w:r>
+      <w:proofErr w:type="gramEnd"/>
+      <w:r>
+        <w:t xml:space="preserve"> Django web application built entirely in Python. Django provides URL routing, server-rendered templates, forms, persistence, migrations, sessions, security protections, and testing support, while project analysis adapters, OpenAI integration, and domain services </w:t>
       </w:r>
       <w:r>
         <w:lastRenderedPageBreak/>
@@ -2943,8 +3104,13 @@
         </w:rPr>
         <w:t xml:space="preserve">Supported input languages - multiple. </w:t>
       </w:r>
-      <w:r>
-        <w:t>The MVP accepts and structurally analyzes Python, Java, JavaScript, and TypeScript files. A repository may contain one or several of these languages. Future adapters can add C#, Go, C/C++, Rust, and other languages without changing the Python-only implementation rule.</w:t>
+      <w:proofErr w:type="gramStart"/>
+      <w:r>
+        <w:t>The MVP</w:t>
+      </w:r>
+      <w:proofErr w:type="gramEnd"/>
+      <w:r>
+        <w:t xml:space="preserve"> accepts and structurally analyzes Python, Java, JavaScript, and TypeScript files. A repository may contain one or several of these languages. Future adapters can add C#, Go, C/C++, Rust, and other languages without changing the Python-only implementation rule.</w:t>
       </w:r>
     </w:p>
     <w:p>
@@ -2955,7 +3121,15 @@
         <w:t xml:space="preserve">Analysis boundary. </w:t>
       </w:r>
       <w:r>
-        <w:t>Each Python adapter emits shared entities such as files, modules or packages, symbols, imports, calls, tests, exception paths, concepts, and source spans. Downstream assessment and analytics services use this language-neutral representation while retaining language-specific evidence.</w:t>
+        <w:t xml:space="preserve">Each Python adapter emits shared entities such as files, modules or packages, symbols, </w:t>
+      </w:r>
+      <w:proofErr w:type="gramStart"/>
+      <w:r>
+        <w:t>imports, calls</w:t>
+      </w:r>
+      <w:proofErr w:type="gramEnd"/>
+      <w:r>
+        <w:t>, tests, exception paths, concepts, and source spans. Downstream assessment and analytics services use this language-neutral representation while retaining language-specific evidence.</w:t>
       </w:r>
     </w:p>
     <w:tbl>
@@ -3123,8 +3297,13 @@
           </w:tcPr>
           <w:p>
             <w:r>
-              <w:t>Python / Django forms / Pydantic</w:t>
-            </w:r>
+              <w:t xml:space="preserve">Python / Django forms / </w:t>
+            </w:r>
+            <w:proofErr w:type="spellStart"/>
+            <w:r>
+              <w:t>Pydantic</w:t>
+            </w:r>
+            <w:proofErr w:type="spellEnd"/>
           </w:p>
         </w:tc>
         <w:tc>
@@ -3231,7 +3410,15 @@
           </w:tcPr>
           <w:p>
             <w:r>
-              <w:t>Python ast, tokenize, and tree-sitter Python bindings</w:t>
+              <w:t xml:space="preserve">Python </w:t>
+            </w:r>
+            <w:proofErr w:type="spellStart"/>
+            <w:r>
+              <w:t>ast</w:t>
+            </w:r>
+            <w:proofErr w:type="spellEnd"/>
+            <w:r>
+              <w:t>, tokenize, and tree-sitter Python bindings</w:t>
             </w:r>
           </w:p>
         </w:tc>
@@ -3247,7 +3434,15 @@
           </w:tcPr>
           <w:p>
             <w:r>
-              <w:t>Parse Python, Java, JavaScript, and TypeScript inputs and normalize language-specific evidence.</w:t>
+              <w:t xml:space="preserve">Parse Python, Java, JavaScript, and TypeScript </w:t>
+            </w:r>
+            <w:proofErr w:type="gramStart"/>
+            <w:r>
+              <w:t>inputs</w:t>
+            </w:r>
+            <w:proofErr w:type="gramEnd"/>
+            <w:r>
+              <w:t xml:space="preserve"> and normalize language-specific evidence.</w:t>
             </w:r>
           </w:p>
         </w:tc>
@@ -3393,8 +3588,21 @@
           </w:tcPr>
           <w:p>
             <w:r>
-              <w:t>Django test framework, pytest, Hypothesis, Ruff, mypy</w:t>
-            </w:r>
+              <w:t xml:space="preserve">Django test framework, </w:t>
+            </w:r>
+            <w:proofErr w:type="spellStart"/>
+            <w:r>
+              <w:t>pytest</w:t>
+            </w:r>
+            <w:proofErr w:type="spellEnd"/>
+            <w:r>
+              <w:t xml:space="preserve">, Hypothesis, Ruff, </w:t>
+            </w:r>
+            <w:proofErr w:type="spellStart"/>
+            <w:r>
+              <w:t>mypy</w:t>
+            </w:r>
+            <w:proofErr w:type="spellEnd"/>
           </w:p>
         </w:tc>
         <w:tc>
@@ -3458,12 +3666,21 @@
       <w:pPr>
         <w:ind w:left="360"/>
       </w:pPr>
+      <w:proofErr w:type="spellStart"/>
       <w:r>
         <w:rPr>
           <w:rFonts w:ascii="Consolas" w:hAnsi="Consolas"/>
           <w:sz w:val="18"/>
         </w:rPr>
-        <w:t>vivarepo/</w:t>
+        <w:t>vivarepo</w:t>
+      </w:r>
+      <w:proofErr w:type="spellEnd"/>
+      <w:r>
+        <w:rPr>
+          <w:rFonts w:ascii="Consolas" w:hAnsi="Consolas"/>
+          <w:sz w:val="18"/>
+        </w:rPr>
+        <w:t>/</w:t>
       </w:r>
       <w:r>
         <w:rPr>
@@ -3615,8 +3832,17 @@
           <w:sz w:val="18"/>
         </w:rPr>
         <w:br/>
-        <w:t xml:space="preserve">  pyproject.toml</w:t>
-      </w:r>
+        <w:t xml:space="preserve">  </w:t>
+      </w:r>
+      <w:proofErr w:type="spellStart"/>
+      <w:r>
+        <w:rPr>
+          <w:rFonts w:ascii="Consolas" w:hAnsi="Consolas"/>
+          <w:sz w:val="18"/>
+        </w:rPr>
+        <w:t>pyproject.toml</w:t>
+      </w:r>
+      <w:proofErr w:type="spellEnd"/>
       <w:r>
         <w:rPr>
           <w:rFonts w:ascii="Consolas" w:hAnsi="Consolas"/>
@@ -3945,7 +4171,15 @@
         <w:spacing w:after="120" w:line="259" w:lineRule="auto"/>
       </w:pPr>
       <w:r>
-        <w:t>OpenAI responses used by the application should be structured rather than free-form wherever feasible. Example fields include question text, concept, difficulty, assessment type, source file, rubric criteria, score, strengths, misconceptions, and recommended next action.</w:t>
+        <w:t xml:space="preserve">OpenAI responses used by the application should be structured rather than </w:t>
+      </w:r>
+      <w:proofErr w:type="gramStart"/>
+      <w:r>
+        <w:t>free-form</w:t>
+      </w:r>
+      <w:proofErr w:type="gramEnd"/>
+      <w:r>
+        <w:t xml:space="preserve"> wherever feasible. Example fields include question text, concept, difficulty, assessment type, source file, rubric criteria, score, strengths, misconceptions, and recommended next action.</w:t>
       </w:r>
     </w:p>
     <w:p>
@@ -4098,12 +4332,14 @@
             </w:tcMar>
           </w:tcPr>
           <w:p>
+            <w:proofErr w:type="spellStart"/>
             <w:r>
               <w:rPr>
                 <w:b/>
               </w:rPr>
               <w:t>CodeEvidence</w:t>
             </w:r>
+            <w:proofErr w:type="spellEnd"/>
           </w:p>
         </w:tc>
         <w:tc>
@@ -4180,12 +4416,14 @@
             </w:tcMar>
           </w:tcPr>
           <w:p>
+            <w:proofErr w:type="spellStart"/>
             <w:r>
               <w:rPr>
                 <w:b/>
               </w:rPr>
               <w:t>ProjectSkillExposure</w:t>
             </w:r>
+            <w:proofErr w:type="spellEnd"/>
           </w:p>
         </w:tc>
         <w:tc>
@@ -4221,12 +4459,14 @@
             </w:tcMar>
           </w:tcPr>
           <w:p>
+            <w:proofErr w:type="spellStart"/>
             <w:r>
               <w:rPr>
                 <w:b/>
               </w:rPr>
               <w:t>AssessmentQuestion</w:t>
             </w:r>
+            <w:proofErr w:type="spellEnd"/>
           </w:p>
         </w:tc>
         <w:tc>
@@ -4262,12 +4502,14 @@
             </w:tcMar>
           </w:tcPr>
           <w:p>
+            <w:proofErr w:type="spellStart"/>
             <w:r>
               <w:rPr>
                 <w:b/>
               </w:rPr>
               <w:t>AssessmentAttempt</w:t>
             </w:r>
+            <w:proofErr w:type="spellEnd"/>
           </w:p>
         </w:tc>
         <w:tc>
@@ -4303,12 +4545,14 @@
             </w:tcMar>
           </w:tcPr>
           <w:p>
+            <w:proofErr w:type="spellStart"/>
             <w:r>
               <w:rPr>
                 <w:b/>
               </w:rPr>
               <w:t>MasterySnapshot</w:t>
             </w:r>
+            <w:proofErr w:type="spellEnd"/>
           </w:p>
         </w:tc>
         <w:tc>
@@ -4344,12 +4588,14 @@
             </w:tcMar>
           </w:tcPr>
           <w:p>
+            <w:proofErr w:type="spellStart"/>
             <w:r>
               <w:rPr>
                 <w:b/>
               </w:rPr>
               <w:t>PracticeRecommendation</w:t>
             </w:r>
+            <w:proofErr w:type="spellEnd"/>
           </w:p>
         </w:tc>
         <w:tc>
@@ -4569,7 +4815,15 @@
         <w:spacing w:after="40" w:line="247" w:lineRule="auto"/>
       </w:pPr>
       <w:r>
-        <w:t>Initial language-neutral skill taxonomy covering relevant programming fundamentals, OOP where applicable, collections and data structures, algorithms, exceptions, testing with JUnit or pytest, SQL/database use, and APIs when evidence exists.</w:t>
+        <w:t xml:space="preserve">Initial language-neutral skill taxonomy covering relevant programming fundamentals, OOP where applicable, collections and data structures, algorithms, exceptions, testing with JUnit or </w:t>
+      </w:r>
+      <w:proofErr w:type="spellStart"/>
+      <w:r>
+        <w:t>pytest</w:t>
+      </w:r>
+      <w:proofErr w:type="spellEnd"/>
+      <w:r>
+        <w:t>, SQL/database use, and APIs when evidence exists.</w:t>
       </w:r>
     </w:p>
     <w:p>
@@ -4640,7 +4894,31 @@
         <w:spacing w:after="40" w:line="247" w:lineRule="auto"/>
       </w:pPr>
       <w:r>
-        <w:t>Automated pytest suites for the VivaRepo Python codebase, including adapter fixtures that recognize JUnit, pytest, and JavaScript/TypeScript test evidence in imported projects.</w:t>
+        <w:t xml:space="preserve">Automated </w:t>
+      </w:r>
+      <w:proofErr w:type="spellStart"/>
+      <w:r>
+        <w:t>pytest</w:t>
+      </w:r>
+      <w:proofErr w:type="spellEnd"/>
+      <w:r>
+        <w:t xml:space="preserve"> suites for the </w:t>
+      </w:r>
+      <w:proofErr w:type="spellStart"/>
+      <w:r>
+        <w:t>VivaRepo</w:t>
+      </w:r>
+      <w:proofErr w:type="spellEnd"/>
+      <w:r>
+        <w:t xml:space="preserve"> Python codebase, including adapter fixtures that recognize JUnit, </w:t>
+      </w:r>
+      <w:proofErr w:type="spellStart"/>
+      <w:r>
+        <w:t>pytest</w:t>
+      </w:r>
+      <w:proofErr w:type="spellEnd"/>
+      <w:r>
+        <w:t>, and JavaScript/TypeScript test evidence in imported projects.</w:t>
       </w:r>
     </w:p>
     <w:p>
@@ -4685,7 +4963,15 @@
         <w:spacing w:after="40" w:line="247" w:lineRule="auto"/>
       </w:pPr>
       <w:r>
-        <w:t>Sandboxed execution for rebuild challenges.</w:t>
+        <w:t xml:space="preserve">Sandboxed execution </w:t>
+      </w:r>
+      <w:proofErr w:type="gramStart"/>
+      <w:r>
+        <w:t>for</w:t>
+      </w:r>
+      <w:proofErr w:type="gramEnd"/>
+      <w:r>
+        <w:t xml:space="preserve"> rebuild challenges.</w:t>
       </w:r>
     </w:p>
     <w:p>
@@ -4755,8 +5041,13 @@
       <w:pPr>
         <w:spacing w:after="120" w:line="259" w:lineRule="auto"/>
       </w:pPr>
-      <w:r>
-        <w:t>VivaRepo should be considered portfolio-ready when a reviewer can see a complete engineering story rather than only an AI demonstration. At minimum, the project should satisfy the following criteria:</w:t>
+      <w:proofErr w:type="spellStart"/>
+      <w:r>
+        <w:t>VivaRepo</w:t>
+      </w:r>
+      <w:proofErr w:type="spellEnd"/>
+      <w:r>
+        <w:t xml:space="preserve"> should be considered portfolio-ready when a reviewer can see a complete engineering story rather than only an AI demonstration. At minimum, the project should satisfy the following criteria:</w:t>
       </w:r>
     </w:p>
     <w:p>
@@ -4851,34 +5142,76 @@
       </w:r>
     </w:p>
     <w:p>
-      <w:r>
-        <w:br/>
+      <w:pPr>
+        <w:pStyle w:val="Heading1"/>
+      </w:pPr>
+      <w:r>
+        <w:t>15. Fall 2026 Milestones and Schedule</w:t>
       </w:r>
     </w:p>
     <w:p>
-      <w:pPr>
-        <w:pStyle w:val="Heading1"/>
-      </w:pPr>
-      <w:r>
-        <w:t>15. Fall 2026 Milestones and Schedule</w:t>
+      <w:r>
+        <w:t xml:space="preserve">The semester plan runs from Monday, August 24, </w:t>
+      </w:r>
+      <w:proofErr w:type="gramStart"/>
+      <w:r>
+        <w:t>2026</w:t>
+      </w:r>
+      <w:proofErr w:type="gramEnd"/>
+      <w:r>
+        <w:t xml:space="preserve"> through Friday, December 18, 2026</w:t>
+      </w:r>
+      <w:r>
+        <w:rPr>
+          <w:b/>
+          <w:bCs/>
+        </w:rPr>
+        <w:t xml:space="preserve">. It is designed for approximately 8 to 10 </w:t>
+      </w:r>
+      <w:proofErr w:type="gramStart"/>
+      <w:r>
+        <w:rPr>
+          <w:b/>
+          <w:bCs/>
+        </w:rPr>
+        <w:t>focused</w:t>
+      </w:r>
+      <w:proofErr w:type="gramEnd"/>
+      <w:r>
+        <w:rPr>
+          <w:b/>
+          <w:bCs/>
+        </w:rPr>
+        <w:t xml:space="preserve"> hours per week,</w:t>
+      </w:r>
+      <w:r>
+        <w:t xml:space="preserve"> with a lighter Thanksgiving week and a feature freeze during the final week. The schedule deliberately builds one narrow, working vertical slice before adding AI evaluation, analytics, and additional input languages.</w:t>
       </w:r>
     </w:p>
     <w:p>
-      <w:r>
-        <w:t>The semester plan runs from Monday, August 24, 2026 through Friday, December 18, 2026. It is designed for approximately 8 to 10 focused hours per week, with a lighter Thanksgiving week and a feature freeze during the final week. The schedule deliberately builds one narrow, working vertical slice before adding AI evaluation, analytics, and additional input languages.</w:t>
-      </w:r>
+      <w:pPr>
+        <w:pStyle w:val="Heading2"/>
+      </w:pPr>
+      <w:r>
+        <w:t xml:space="preserve">15.1 Complexity progression and scope </w:t>
+      </w:r>
+      <w:proofErr w:type="gramStart"/>
+      <w:r>
+        <w:t>tiers</w:t>
+      </w:r>
+      <w:proofErr w:type="gramEnd"/>
     </w:p>
     <w:p>
-      <w:pPr>
-        <w:pStyle w:val="Heading2"/>
-      </w:pPr>
-      <w:r>
-        <w:t>15.1 Complexity progression and scope tiers</w:t>
-      </w:r>
-    </w:p>
-    <w:p>
-      <w:r>
-        <w:t>The controlling principle is: make one path work end to end, then deepen it, then broaden it. A polished Python-input application is more valuable than four partially working language adapters.</w:t>
+      <w:r>
+        <w:t xml:space="preserve">The controlling principle </w:t>
+      </w:r>
+      <w:proofErr w:type="gramStart"/>
+      <w:r>
+        <w:t>is:</w:t>
+      </w:r>
+      <w:proofErr w:type="gramEnd"/>
+      <w:r>
+        <w:t xml:space="preserve"> make one path work end to end, then deepen it, then broaden it. A polished Python-input application is more valuable than four partially working language adapters.</w:t>
       </w:r>
     </w:p>
     <w:tbl>
@@ -5260,7 +5593,23 @@
     </w:p>
     <w:p>
       <w:r>
-        <w:t>Each milestone ends with a demoable outcome, automated checks, and a short written checkpoint. Do not begin the next milestone until the current acceptance test passes or the remaining work is explicitly moved to the backlog.</w:t>
+        <w:t xml:space="preserve">Each milestone ends with a </w:t>
+      </w:r>
+      <w:proofErr w:type="spellStart"/>
+      <w:r>
+        <w:t>demoable</w:t>
+      </w:r>
+      <w:proofErr w:type="spellEnd"/>
+      <w:r>
+        <w:t xml:space="preserve"> outcome, automated checks, and a </w:t>
+      </w:r>
+      <w:proofErr w:type="gramStart"/>
+      <w:r>
+        <w:t>short written</w:t>
+      </w:r>
+      <w:proofErr w:type="gramEnd"/>
+      <w:r>
+        <w:t xml:space="preserve"> checkpoint. Do not begin the next milestone until the current acceptance test passes or the remaining work is explicitly moved to the backlog.</w:t>
       </w:r>
     </w:p>
     <w:tbl>
@@ -5438,7 +5787,23 @@
                 <w:b/>
                 <w:sz w:val="17"/>
               </w:rPr>
-              <w:t>Create the repository and Django project; add pyproject.toml, a core Django app, health view and URL, Django-template homepage, smoke test, lint/type-check configuration, README, and first architecture decision record.</w:t>
+              <w:t xml:space="preserve">Create the repository and Django project; add </w:t>
+            </w:r>
+            <w:proofErr w:type="spellStart"/>
+            <w:r>
+              <w:rPr>
+                <w:b/>
+                <w:sz w:val="17"/>
+              </w:rPr>
+              <w:t>pyproject.toml</w:t>
+            </w:r>
+            <w:proofErr w:type="spellEnd"/>
+            <w:r>
+              <w:rPr>
+                <w:b/>
+                <w:sz w:val="17"/>
+              </w:rPr>
+              <w:t>, a core Django app, health view and URL, Django-template homepage, smoke test, lint/type-check configuration, README, and first architecture decision record.</w:t>
             </w:r>
           </w:p>
         </w:tc>
@@ -5637,28 +6002,108 @@
                 <w:b/>
                 <w:sz w:val="17"/>
               </w:rPr>
-              <w:t>Implement the shared models and first adapter using Python ast/tokenize. Extract modules, functions, classes, imports, calls, exceptions, type hints, and pytest evidence.</w:t>
-            </w:r>
-          </w:p>
-        </w:tc>
-        <w:tc>
-          <w:tcPr>
-            <w:tcW w:w="2880" w:type="dxa"/>
-            <w:tcMar>
-              <w:top w:w="100" w:type="dxa"/>
-              <w:left w:w="100" w:type="dxa"/>
-              <w:bottom w:w="100" w:type="dxa"/>
-              <w:right w:w="100" w:type="dxa"/>
-            </w:tcMar>
-            <w:vAlign w:val="center"/>
-          </w:tcPr>
-          <w:p>
+              <w:t xml:space="preserve">Implement the shared models and first adapter using Python </w:t>
+            </w:r>
+            <w:proofErr w:type="spellStart"/>
             <w:r>
               <w:rPr>
                 <w:b/>
                 <w:sz w:val="17"/>
               </w:rPr>
-              <w:t>Golden fixtures produce stable CodeEntity, CodeRelation, and SourceSpan records; malformed files fail independently.</w:t>
+              <w:t>ast</w:t>
+            </w:r>
+            <w:proofErr w:type="spellEnd"/>
+            <w:r>
+              <w:rPr>
+                <w:b/>
+                <w:sz w:val="17"/>
+              </w:rPr>
+              <w:t xml:space="preserve">/tokenize. Extract modules, functions, classes, imports, calls, exceptions, type hints, and </w:t>
+            </w:r>
+            <w:proofErr w:type="spellStart"/>
+            <w:r>
+              <w:rPr>
+                <w:b/>
+                <w:sz w:val="17"/>
+              </w:rPr>
+              <w:t>pytest</w:t>
+            </w:r>
+            <w:proofErr w:type="spellEnd"/>
+            <w:r>
+              <w:rPr>
+                <w:b/>
+                <w:sz w:val="17"/>
+              </w:rPr>
+              <w:t xml:space="preserve"> evidence.</w:t>
+            </w:r>
+          </w:p>
+        </w:tc>
+        <w:tc>
+          <w:tcPr>
+            <w:tcW w:w="2880" w:type="dxa"/>
+            <w:tcMar>
+              <w:top w:w="100" w:type="dxa"/>
+              <w:left w:w="100" w:type="dxa"/>
+              <w:bottom w:w="100" w:type="dxa"/>
+              <w:right w:w="100" w:type="dxa"/>
+            </w:tcMar>
+            <w:vAlign w:val="center"/>
+          </w:tcPr>
+          <w:p>
+            <w:r>
+              <w:rPr>
+                <w:b/>
+                <w:sz w:val="17"/>
+              </w:rPr>
+              <w:t xml:space="preserve">Golden fixtures produce stable </w:t>
+            </w:r>
+            <w:proofErr w:type="spellStart"/>
+            <w:r>
+              <w:rPr>
+                <w:b/>
+                <w:sz w:val="17"/>
+              </w:rPr>
+              <w:t>CodeEntity</w:t>
+            </w:r>
+            <w:proofErr w:type="spellEnd"/>
+            <w:r>
+              <w:rPr>
+                <w:b/>
+                <w:sz w:val="17"/>
+              </w:rPr>
+              <w:t xml:space="preserve">, </w:t>
+            </w:r>
+            <w:proofErr w:type="spellStart"/>
+            <w:r>
+              <w:rPr>
+                <w:b/>
+                <w:sz w:val="17"/>
+              </w:rPr>
+              <w:t>CodeRelation</w:t>
+            </w:r>
+            <w:proofErr w:type="spellEnd"/>
+            <w:r>
+              <w:rPr>
+                <w:b/>
+                <w:sz w:val="17"/>
+              </w:rPr>
+              <w:t xml:space="preserve">, and </w:t>
+            </w:r>
+            <w:proofErr w:type="spellStart"/>
+            <w:r>
+              <w:rPr>
+                <w:b/>
+                <w:sz w:val="17"/>
+              </w:rPr>
+              <w:t>SourceSpan</w:t>
+            </w:r>
+            <w:proofErr w:type="spellEnd"/>
+            <w:r>
+              <w:rPr>
+                <w:b/>
+                <w:sz w:val="17"/>
+              </w:rPr>
+              <w:t xml:space="preserve"> records; malformed files fail independently.</w:t>
             </w:r>
           </w:p>
         </w:tc>
@@ -6018,7 +6463,23 @@
                 <w:b/>
                 <w:sz w:val="17"/>
               </w:rPr>
-              <w:t>One benchmark Python project supports all assessment modes and each mode records a distinct evidence type.</w:t>
+              <w:t xml:space="preserve">One benchmark Python project supports all assessment </w:t>
+            </w:r>
+            <w:proofErr w:type="gramStart"/>
+            <w:r>
+              <w:rPr>
+                <w:b/>
+                <w:sz w:val="17"/>
+              </w:rPr>
+              <w:t>modes</w:t>
+            </w:r>
+            <w:proofErr w:type="gramEnd"/>
+            <w:r>
+              <w:rPr>
+                <w:b/>
+                <w:sz w:val="17"/>
+              </w:rPr>
+              <w:t xml:space="preserve"> and each mode records a distinct evidence type.</w:t>
             </w:r>
           </w:p>
         </w:tc>
@@ -6200,7 +6661,23 @@
                 <w:b/>
                 <w:sz w:val="17"/>
               </w:rPr>
-              <w:t>The Python portfolio core is stable, documented, and demoable before multilingual expansion begins.</w:t>
+              <w:t xml:space="preserve">The Python portfolio core is stable, documented, and </w:t>
+            </w:r>
+            <w:proofErr w:type="spellStart"/>
+            <w:r>
+              <w:rPr>
+                <w:b/>
+                <w:sz w:val="17"/>
+              </w:rPr>
+              <w:t>demoable</w:t>
+            </w:r>
+            <w:proofErr w:type="spellEnd"/>
+            <w:r>
+              <w:rPr>
+                <w:b/>
+                <w:sz w:val="17"/>
+              </w:rPr>
+              <w:t xml:space="preserve"> before multilingual expansion begins.</w:t>
             </w:r>
           </w:p>
         </w:tc>
@@ -6268,28 +6745,60 @@
                 <w:b/>
                 <w:sz w:val="17"/>
               </w:rPr>
-              <w:t>Implement the Java adapter through tree-sitter Python bindings. Extract packages, classes, methods, interfaces, inheritance, calls, exceptions, annotations, and JUnit evidence.</w:t>
-            </w:r>
-          </w:p>
-        </w:tc>
-        <w:tc>
-          <w:tcPr>
-            <w:tcW w:w="2880" w:type="dxa"/>
-            <w:tcMar>
-              <w:top w:w="100" w:type="dxa"/>
-              <w:left w:w="100" w:type="dxa"/>
-              <w:bottom w:w="100" w:type="dxa"/>
-              <w:right w:w="100" w:type="dxa"/>
-            </w:tcMar>
-            <w:vAlign w:val="center"/>
-          </w:tcPr>
-          <w:p>
+              <w:t xml:space="preserve">Implement the Java adapter through </w:t>
+            </w:r>
+            <w:proofErr w:type="gramStart"/>
             <w:r>
               <w:rPr>
                 <w:b/>
                 <w:sz w:val="17"/>
               </w:rPr>
-              <w:t>The Java adapter passes the same contract tests as the Python adapter and produces language-appropriate evidence and questions.</w:t>
+              <w:t>tree</w:t>
+            </w:r>
+            <w:proofErr w:type="gramEnd"/>
+            <w:r>
+              <w:rPr>
+                <w:b/>
+                <w:sz w:val="17"/>
+              </w:rPr>
+              <w:t>-sitter Python bindings. Extract packages, classes, methods, interfaces, inheritance, calls, exceptions, annotations, and JUnit evidence.</w:t>
+            </w:r>
+          </w:p>
+        </w:tc>
+        <w:tc>
+          <w:tcPr>
+            <w:tcW w:w="2880" w:type="dxa"/>
+            <w:tcMar>
+              <w:top w:w="100" w:type="dxa"/>
+              <w:left w:w="100" w:type="dxa"/>
+              <w:bottom w:w="100" w:type="dxa"/>
+              <w:right w:w="100" w:type="dxa"/>
+            </w:tcMar>
+            <w:vAlign w:val="center"/>
+          </w:tcPr>
+          <w:p>
+            <w:r>
+              <w:rPr>
+                <w:b/>
+                <w:sz w:val="17"/>
+              </w:rPr>
+              <w:t xml:space="preserve">The Java adapter passes the same contract tests as the Python adapter and produces </w:t>
+            </w:r>
+            <w:proofErr w:type="gramStart"/>
+            <w:r>
+              <w:rPr>
+                <w:b/>
+                <w:sz w:val="17"/>
+              </w:rPr>
+              <w:t>language-appropriate</w:t>
+            </w:r>
+            <w:proofErr w:type="gramEnd"/>
+            <w:r>
+              <w:rPr>
+                <w:b/>
+                <w:sz w:val="17"/>
+              </w:rPr>
+              <w:t xml:space="preserve"> evidence and questions.</w:t>
             </w:r>
           </w:p>
         </w:tc>
@@ -6642,7 +7151,23 @@
                 <w:b/>
                 <w:sz w:val="17"/>
               </w:rPr>
-              <w:t>Choose one demoable weekly outcome, define acceptance criteria, and select no more than three to five tasks.</w:t>
+              <w:t xml:space="preserve">Choose one </w:t>
+            </w:r>
+            <w:proofErr w:type="spellStart"/>
+            <w:r>
+              <w:rPr>
+                <w:b/>
+                <w:sz w:val="17"/>
+              </w:rPr>
+              <w:t>demoable</w:t>
+            </w:r>
+            <w:proofErr w:type="spellEnd"/>
+            <w:r>
+              <w:rPr>
+                <w:b/>
+                <w:sz w:val="17"/>
+              </w:rPr>
+              <w:t xml:space="preserve"> weekly outcome, define acceptance criteria, and select no more than three to five tasks.</w:t>
             </w:r>
           </w:p>
         </w:tc>
@@ -6935,7 +7460,15 @@
     </w:p>
     <w:p>
       <w:r>
-        <w:t>The first week is intentionally small. Its purpose is to remove setup uncertainty and create a repeatable build-test-run loop; it is not the week to implement code analysis or call the OpenAI API.</w:t>
+        <w:t xml:space="preserve">The first week is intentionally small. Its purpose is to remove </w:t>
+      </w:r>
+      <w:proofErr w:type="gramStart"/>
+      <w:r>
+        <w:t>setup</w:t>
+      </w:r>
+      <w:proofErr w:type="gramEnd"/>
+      <w:r>
+        <w:t xml:space="preserve"> uncertainty and create a repeatable build-test-run loop; it is not the week to implement code analysis or call the OpenAI API.</w:t>
       </w:r>
     </w:p>
     <w:tbl>
@@ -7089,7 +7622,39 @@
                 <w:b/>
                 <w:sz w:val="17"/>
               </w:rPr>
-              <w:t>Create the repository, README problem statement, Python package, pyproject.toml, .gitignore, and initial folder structure.</w:t>
+              <w:t xml:space="preserve">Create the repository, README problem statement, Python package, </w:t>
+            </w:r>
+            <w:proofErr w:type="spellStart"/>
+            <w:r>
+              <w:rPr>
+                <w:b/>
+                <w:sz w:val="17"/>
+              </w:rPr>
+              <w:t>pyproject.toml</w:t>
+            </w:r>
+            <w:proofErr w:type="spellEnd"/>
+            <w:r>
+              <w:rPr>
+                <w:b/>
+                <w:sz w:val="17"/>
+              </w:rPr>
+              <w:t>, .</w:t>
+            </w:r>
+            <w:proofErr w:type="spellStart"/>
+            <w:r>
+              <w:rPr>
+                <w:b/>
+                <w:sz w:val="17"/>
+              </w:rPr>
+              <w:t>gitignore</w:t>
+            </w:r>
+            <w:proofErr w:type="spellEnd"/>
+            <w:r>
+              <w:rPr>
+                <w:b/>
+                <w:sz w:val="17"/>
+              </w:rPr>
+              <w:t>, and initial folder structure.</w:t>
             </w:r>
           </w:p>
         </w:tc>
@@ -7293,7 +7858,39 @@
                 <w:b/>
                 <w:sz w:val="17"/>
               </w:rPr>
-              <w:t>Configure pytest, Ruff, and mypy; add a simple automated workflow if available; document environment setup and common commands.</w:t>
+              <w:t xml:space="preserve">Configure </w:t>
+            </w:r>
+            <w:proofErr w:type="spellStart"/>
+            <w:r>
+              <w:rPr>
+                <w:b/>
+                <w:sz w:val="17"/>
+              </w:rPr>
+              <w:t>pytest</w:t>
+            </w:r>
+            <w:proofErr w:type="spellEnd"/>
+            <w:r>
+              <w:rPr>
+                <w:b/>
+                <w:sz w:val="17"/>
+              </w:rPr>
+              <w:t xml:space="preserve">, Ruff, and </w:t>
+            </w:r>
+            <w:proofErr w:type="spellStart"/>
+            <w:r>
+              <w:rPr>
+                <w:b/>
+                <w:sz w:val="17"/>
+              </w:rPr>
+              <w:t>mypy</w:t>
+            </w:r>
+            <w:proofErr w:type="spellEnd"/>
+            <w:r>
+              <w:rPr>
+                <w:b/>
+                <w:sz w:val="17"/>
+              </w:rPr>
+              <w:t>; add a simple automated workflow if available; document environment setup and common commands.</w:t>
             </w:r>
           </w:p>
         </w:tc>
@@ -7387,8 +7984,13 @@
       <w:pPr>
         <w:pStyle w:val="ListBullet"/>
       </w:pPr>
-      <w:r>
-        <w:t>The feature can be demonstrated through the user interface or a documented developer command.</w:t>
+      <w:proofErr w:type="gramStart"/>
+      <w:r>
+        <w:t>The</w:t>
+      </w:r>
+      <w:proofErr w:type="gramEnd"/>
+      <w:r>
+        <w:t xml:space="preserve"> feature can be demonstrated through the user interface or a documented developer command.</w:t>
       </w:r>
     </w:p>
     <w:p>
@@ -7428,7 +8030,15 @@
         <w:pStyle w:val="ListBullet"/>
       </w:pPr>
       <w:r>
-        <w:t>The milestone ends with a small tagged checkpoint that can be restored and demonstrated.</w:t>
+        <w:t xml:space="preserve">The milestone ends with a </w:t>
+      </w:r>
+      <w:proofErr w:type="gramStart"/>
+      <w:r>
+        <w:t>small tagged</w:t>
+      </w:r>
+      <w:proofErr w:type="gramEnd"/>
+      <w:r>
+        <w:t xml:space="preserve"> checkpoint that can be restored and demonstrated.</w:t>
       </w:r>
     </w:p>
     <w:p>
@@ -7603,12 +8213,21 @@
             <w:vAlign w:val="center"/>
           </w:tcPr>
           <w:p>
+            <w:proofErr w:type="gramStart"/>
             <w:r>
               <w:rPr>
                 <w:b/>
                 <w:sz w:val="17"/>
               </w:rPr>
-              <w:t>Avoids turning sandbox security into an unplanned semester-scale project.</w:t>
+              <w:t>Avoids</w:t>
+            </w:r>
+            <w:proofErr w:type="gramEnd"/>
+            <w:r>
+              <w:rPr>
+                <w:b/>
+                <w:sz w:val="17"/>
+              </w:rPr>
+              <w:t xml:space="preserve"> turning sandbox security into an unplanned semester-scale project.</w:t>
             </w:r>
           </w:p>
         </w:tc>
@@ -7817,7 +8436,14 @@
             </w:r>
             <w:r>
               <w:br/>
-              <w:t>VivaRepo is a Python-only, local-first web application that analyzes projects containing Python, Java, JavaScript, and TypeScript source files, maps multilingual repository evidence to CS skills, generates language-aware project-specific mastery assessments with the OpenAI API, and measures the gap between project complexity and the developer's independently demonstrated ability to explain, trace, debug, modify, rebuild, and defend the code.</w:t>
+            </w:r>
+            <w:proofErr w:type="spellStart"/>
+            <w:r>
+              <w:t>VivaRepo</w:t>
+            </w:r>
+            <w:proofErr w:type="spellEnd"/>
+            <w:r>
+              <w:t xml:space="preserve"> is a Python-only, local-first web application that analyzes projects containing Python, Java, JavaScript, and TypeScript source files, maps multilingual repository evidence to CS skills, generates language-aware project-specific mastery assessments with the OpenAI API, and measures the gap between project complexity and the developer's independently demonstrated ability to explain, trace, debug, modify, rebuild, and defend the code.</w:t>
             </w:r>
           </w:p>
         </w:tc>
@@ -7854,7 +8480,15 @@
     </w:p>
     <w:p>
       <w:r>
-        <w:t>The sources below provide background evidence for the problem statement and product-design rationale. Several studies are early-stage or context-specific, so VivaRepo should treat their findings as motivation for testable product hypotheses rather than universal conclusions.</w:t>
+        <w:t xml:space="preserve">The sources below provide background evidence for the problem statement and product-design rationale. Several studies are early-stage or context-specific, so </w:t>
+      </w:r>
+      <w:proofErr w:type="spellStart"/>
+      <w:r>
+        <w:t>VivaRepo</w:t>
+      </w:r>
+      <w:proofErr w:type="spellEnd"/>
+      <w:r>
+        <w:t xml:space="preserve"> should treat their findings as motivation for testable product hypotheses rather than universal conclusions.</w:t>
       </w:r>
     </w:p>
     <w:p>
@@ -7929,7 +8563,15 @@
     </w:p>
     <w:p>
       <w:r>
-        <w:t xml:space="preserve">[6] HackerRank. (2025). 2025 Developer Skills Report. </w:t>
+        <w:t xml:space="preserve">[6] </w:t>
+      </w:r>
+      <w:proofErr w:type="spellStart"/>
+      <w:r>
+        <w:t>HackerRank</w:t>
+      </w:r>
+      <w:proofErr w:type="spellEnd"/>
+      <w:r>
+        <w:t xml:space="preserve">. (2025). 2025 Developer Skills Report. </w:t>
       </w:r>
       <w:hyperlink r:id="rId13">
         <w:r>
@@ -7954,7 +8596,7 @@
 </file>
 
 <file path=word/endnotes.xml><?xml version="1.0" encoding="utf-8"?>
-<w:endnotes xmlns:wpc="http://schemas.microsoft.com/office/word/2010/wordprocessingCanvas" xmlns:cx="http://schemas.microsoft.com/office/drawing/2014/chartex" xmlns:cx1="http://schemas.microsoft.com/office/drawing/2015/9/8/chartex" xmlns:cx2="http://schemas.microsoft.com/office/drawing/2015/10/21/chartex" xmlns:cx3="http://schemas.microsoft.com/office/drawing/2016/5/9/chartex" xmlns:cx4="http://schemas.microsoft.com/office/drawing/2016/5/10/chartex" xmlns:cx5="http://schemas.microsoft.com/office/drawing/2016/5/11/chartex" xmlns:cx6="http://schemas.microsoft.com/office/drawing/2016/5/12/chartex" xmlns:cx7="http://schemas.microsoft.com/office/drawing/2016/5/13/chartex" xmlns:cx8="http://schemas.microsoft.com/office/drawing/2016/5/14/chartex" xmlns:mc="http://schemas.openxmlformats.org/markup-compatibility/2006" xmlns:aink="http://schemas.microsoft.com/office/drawing/2016/ink" xmlns:am3d="http://schemas.microsoft.com/office/drawing/2017/model3d" xmlns:o="urn:schemas-microsoft-com:office:office" xmlns:oel="http://schemas.microsoft.com/office/2019/extlst" xmlns:r="http://schemas.openxmlformats.org/officeDocument/2006/relationships" xmlns:m="http://schemas.openxmlformats.org/officeDocument/2006/math" xmlns:v="urn:schemas-microsoft-com:vml" xmlns:wp14="http://schemas.microsoft.com/office/word/2010/wordprocessingDrawing" xmlns:wp="http://schemas.openxmlformats.org/drawingml/2006/wordprocessingDrawing" xmlns:w10="urn:schemas-microsoft-com:office:word" xmlns:w="http://schemas.openxmlformats.org/wordprocessingml/2006/main" xmlns:w14="http://schemas.microsoft.com/office/word/2010/wordml" xmlns:w15="http://schemas.microsoft.com/office/word/2012/wordml" xmlns:w16cei="http://schemas.microsoft.com/office/word/2026/wordml/cei" xmlns:w16cex="http://schemas.microsoft.com/office/word/2018/wordml/cex" xmlns:w16cid="http://schemas.microsoft.com/office/word/2016/wordml/cid" xmlns:w16="http://schemas.microsoft.com/office/word/2018/wordml" xmlns:w16du="http://schemas.microsoft.com/office/word/2023/wordml/word16du" xmlns:w16sdtdh="http://schemas.microsoft.com/office/word/2020/wordml/sdtdatahash" xmlns:w16sdtfl="http://schemas.microsoft.com/office/word/2024/wordml/sdtformatlock" xmlns:w16se="http://schemas.microsoft.com/office/word/2015/wordml/symex" xmlns:wpg="http://schemas.microsoft.com/office/word/2010/wordprocessingGroup" xmlns:wpi="http://schemas.microsoft.com/office/word/2010/wordprocessingInk" xmlns:wne="http://schemas.microsoft.com/office/word/2006/wordml" xmlns:wps="http://schemas.microsoft.com/office/word/2010/wordprocessingShape" mc:Ignorable="w14 w15 w16se w16cid w16 w16cex w16sdtdh w16sdtfl w16du wp14">
+<w:endnotes xmlns:wpc="http://schemas.microsoft.com/office/word/2010/wordprocessingCanvas" xmlns:cx="http://schemas.microsoft.com/office/drawing/2014/chartex" xmlns:cx1="http://schemas.microsoft.com/office/drawing/2015/9/8/chartex" xmlns:cx2="http://schemas.microsoft.com/office/drawing/2015/10/21/chartex" xmlns:cx3="http://schemas.microsoft.com/office/drawing/2016/5/9/chartex" xmlns:cx4="http://schemas.microsoft.com/office/drawing/2016/5/10/chartex" xmlns:cx5="http://schemas.microsoft.com/office/drawing/2016/5/11/chartex" xmlns:cx6="http://schemas.microsoft.com/office/drawing/2016/5/12/chartex" xmlns:cx7="http://schemas.microsoft.com/office/drawing/2016/5/13/chartex" xmlns:cx8="http://schemas.microsoft.com/office/drawing/2016/5/14/chartex" xmlns:mc="http://schemas.openxmlformats.org/markup-compatibility/2006" xmlns:aink="http://schemas.microsoft.com/office/drawing/2016/ink" xmlns:am3d="http://schemas.microsoft.com/office/drawing/2017/model3d" xmlns:o="urn:schemas-microsoft-com:office:office" xmlns:oel="http://schemas.microsoft.com/office/2019/extlst" xmlns:r="http://schemas.openxmlformats.org/officeDocument/2006/relationships" xmlns:m="http://schemas.openxmlformats.org/officeDocument/2006/math" xmlns:v="urn:schemas-microsoft-com:vml" xmlns:wp14="http://schemas.microsoft.com/office/word/2010/wordprocessingDrawing" xmlns:wp="http://schemas.openxmlformats.org/drawingml/2006/wordprocessingDrawing" xmlns:w10="urn:schemas-microsoft-com:office:word" xmlns:w="http://schemas.openxmlformats.org/wordprocessingml/2006/main" xmlns:w14="http://schemas.microsoft.com/office/word/2010/wordml" xmlns:w15="http://schemas.microsoft.com/office/word/2012/wordml" xmlns:w16cex="http://schemas.microsoft.com/office/word/2018/wordml/cex" xmlns:w16cid="http://schemas.microsoft.com/office/word/2016/wordml/cid" xmlns:w16="http://schemas.microsoft.com/office/word/2018/wordml" xmlns:w16du="http://schemas.microsoft.com/office/word/2023/wordml/word16du" xmlns:w16sdtdh="http://schemas.microsoft.com/office/word/2020/wordml/sdtdatahash" xmlns:w16sdtfl="http://schemas.microsoft.com/office/word/2024/wordml/sdtformatlock" xmlns:w16se="http://schemas.microsoft.com/office/word/2015/wordml/symex" xmlns:wpg="http://schemas.microsoft.com/office/word/2010/wordprocessingGroup" xmlns:wpi="http://schemas.microsoft.com/office/word/2010/wordprocessingInk" xmlns:wne="http://schemas.microsoft.com/office/word/2006/wordml" xmlns:wps="http://schemas.microsoft.com/office/word/2010/wordprocessingShape" mc:Ignorable="w14 w15 w16se w16cid w16 w16cex w16sdtdh w16sdtfl w16du wp14">
   <w:endnote w:type="separator" w:id="-1">
     <w:p>
       <w:pPr>
@@ -7979,7 +8621,7 @@
 </file>
 
 <file path=word/footer1.xml><?xml version="1.0" encoding="utf-8"?>
-<w:ftr xmlns:wpc="http://schemas.microsoft.com/office/word/2010/wordprocessingCanvas" xmlns:cx="http://schemas.microsoft.com/office/drawing/2014/chartex" xmlns:cx1="http://schemas.microsoft.com/office/drawing/2015/9/8/chartex" xmlns:cx2="http://schemas.microsoft.com/office/drawing/2015/10/21/chartex" xmlns:cx3="http://schemas.microsoft.com/office/drawing/2016/5/9/chartex" xmlns:cx4="http://schemas.microsoft.com/office/drawing/2016/5/10/chartex" xmlns:cx5="http://schemas.microsoft.com/office/drawing/2016/5/11/chartex" xmlns:cx6="http://schemas.microsoft.com/office/drawing/2016/5/12/chartex" xmlns:cx7="http://schemas.microsoft.com/office/drawing/2016/5/13/chartex" xmlns:cx8="http://schemas.microsoft.com/office/drawing/2016/5/14/chartex" xmlns:mc="http://schemas.openxmlformats.org/markup-compatibility/2006" xmlns:aink="http://schemas.microsoft.com/office/drawing/2016/ink" xmlns:am3d="http://schemas.microsoft.com/office/drawing/2017/model3d" xmlns:o="urn:schemas-microsoft-com:office:office" xmlns:oel="http://schemas.microsoft.com/office/2019/extlst" xmlns:r="http://schemas.openxmlformats.org/officeDocument/2006/relationships" xmlns:m="http://schemas.openxmlformats.org/officeDocument/2006/math" xmlns:v="urn:schemas-microsoft-com:vml" xmlns:wp14="http://schemas.microsoft.com/office/word/2010/wordprocessingDrawing" xmlns:wp="http://schemas.openxmlformats.org/drawingml/2006/wordprocessingDrawing" xmlns:w10="urn:schemas-microsoft-com:office:word" xmlns:w="http://schemas.openxmlformats.org/wordprocessingml/2006/main" xmlns:w14="http://schemas.microsoft.com/office/word/2010/wordml" xmlns:w15="http://schemas.microsoft.com/office/word/2012/wordml" xmlns:w16cei="http://schemas.microsoft.com/office/word/2026/wordml/cei" xmlns:w16cex="http://schemas.microsoft.com/office/word/2018/wordml/cex" xmlns:w16cid="http://schemas.microsoft.com/office/word/2016/wordml/cid" xmlns:w16="http://schemas.microsoft.com/office/word/2018/wordml" xmlns:w16du="http://schemas.microsoft.com/office/word/2023/wordml/word16du" xmlns:w16sdtdh="http://schemas.microsoft.com/office/word/2020/wordml/sdtdatahash" xmlns:w16sdtfl="http://schemas.microsoft.com/office/word/2024/wordml/sdtformatlock" xmlns:w16se="http://schemas.microsoft.com/office/word/2015/wordml/symex" xmlns:wpg="http://schemas.microsoft.com/office/word/2010/wordprocessingGroup" xmlns:wpi="http://schemas.microsoft.com/office/word/2010/wordprocessingInk" xmlns:wne="http://schemas.microsoft.com/office/word/2006/wordml" xmlns:wps="http://schemas.microsoft.com/office/word/2010/wordprocessingShape" mc:Ignorable="w14 w15 w16se w16cid w16 w16cex w16sdtdh w16sdtfl w16du wp14">
+<w:ftr xmlns:wpc="http://schemas.microsoft.com/office/word/2010/wordprocessingCanvas" xmlns:cx="http://schemas.microsoft.com/office/drawing/2014/chartex" xmlns:cx1="http://schemas.microsoft.com/office/drawing/2015/9/8/chartex" xmlns:cx2="http://schemas.microsoft.com/office/drawing/2015/10/21/chartex" xmlns:cx3="http://schemas.microsoft.com/office/drawing/2016/5/9/chartex" xmlns:cx4="http://schemas.microsoft.com/office/drawing/2016/5/10/chartex" xmlns:cx5="http://schemas.microsoft.com/office/drawing/2016/5/11/chartex" xmlns:cx6="http://schemas.microsoft.com/office/drawing/2016/5/12/chartex" xmlns:cx7="http://schemas.microsoft.com/office/drawing/2016/5/13/chartex" xmlns:cx8="http://schemas.microsoft.com/office/drawing/2016/5/14/chartex" xmlns:mc="http://schemas.openxmlformats.org/markup-compatibility/2006" xmlns:aink="http://schemas.microsoft.com/office/drawing/2016/ink" xmlns:am3d="http://schemas.microsoft.com/office/drawing/2017/model3d" xmlns:o="urn:schemas-microsoft-com:office:office" xmlns:oel="http://schemas.microsoft.com/office/2019/extlst" xmlns:r="http://schemas.openxmlformats.org/officeDocument/2006/relationships" xmlns:m="http://schemas.openxmlformats.org/officeDocument/2006/math" xmlns:v="urn:schemas-microsoft-com:vml" xmlns:wp14="http://schemas.microsoft.com/office/word/2010/wordprocessingDrawing" xmlns:wp="http://schemas.openxmlformats.org/drawingml/2006/wordprocessingDrawing" xmlns:w10="urn:schemas-microsoft-com:office:word" xmlns:w="http://schemas.openxmlformats.org/wordprocessingml/2006/main" xmlns:w14="http://schemas.microsoft.com/office/word/2010/wordml" xmlns:w15="http://schemas.microsoft.com/office/word/2012/wordml" xmlns:w16cex="http://schemas.microsoft.com/office/word/2018/wordml/cex" xmlns:w16cid="http://schemas.microsoft.com/office/word/2016/wordml/cid" xmlns:w16="http://schemas.microsoft.com/office/word/2018/wordml" xmlns:w16du="http://schemas.microsoft.com/office/word/2023/wordml/word16du" xmlns:w16sdtdh="http://schemas.microsoft.com/office/word/2020/wordml/sdtdatahash" xmlns:w16sdtfl="http://schemas.microsoft.com/office/word/2024/wordml/sdtformatlock" xmlns:w16se="http://schemas.microsoft.com/office/word/2015/wordml/symex" xmlns:wpg="http://schemas.microsoft.com/office/word/2010/wordprocessingGroup" xmlns:wpi="http://schemas.microsoft.com/office/word/2010/wordprocessingInk" xmlns:wne="http://schemas.microsoft.com/office/word/2006/wordml" xmlns:wps="http://schemas.microsoft.com/office/word/2010/wordprocessingShape" mc:Ignorable="w14 w15 w16se w16cid w16 w16cex w16sdtdh w16sdtfl w16du wp14">
   <w:p>
     <w:pPr>
       <w:pStyle w:val="Footer"/>
@@ -8006,7 +8648,7 @@
 </file>
 
 <file path=word/footnotes.xml><?xml version="1.0" encoding="utf-8"?>
-<w:footnotes xmlns:wpc="http://schemas.microsoft.com/office/word/2010/wordprocessingCanvas" xmlns:cx="http://schemas.microsoft.com/office/drawing/2014/chartex" xmlns:cx1="http://schemas.microsoft.com/office/drawing/2015/9/8/chartex" xmlns:cx2="http://schemas.microsoft.com/office/drawing/2015/10/21/chartex" xmlns:cx3="http://schemas.microsoft.com/office/drawing/2016/5/9/chartex" xmlns:cx4="http://schemas.microsoft.com/office/drawing/2016/5/10/chartex" xmlns:cx5="http://schemas.microsoft.com/office/drawing/2016/5/11/chartex" xmlns:cx6="http://schemas.microsoft.com/office/drawing/2016/5/12/chartex" xmlns:cx7="http://schemas.microsoft.com/office/drawing/2016/5/13/chartex" xmlns:cx8="http://schemas.microsoft.com/office/drawing/2016/5/14/chartex" xmlns:mc="http://schemas.openxmlformats.org/markup-compatibility/2006" xmlns:aink="http://schemas.microsoft.com/office/drawing/2016/ink" xmlns:am3d="http://schemas.microsoft.com/office/drawing/2017/model3d" xmlns:o="urn:schemas-microsoft-com:office:office" xmlns:oel="http://schemas.microsoft.com/office/2019/extlst" xmlns:r="http://schemas.openxmlformats.org/officeDocument/2006/relationships" xmlns:m="http://schemas.openxmlformats.org/officeDocument/2006/math" xmlns:v="urn:schemas-microsoft-com:vml" xmlns:wp14="http://schemas.microsoft.com/office/word/2010/wordprocessingDrawing" xmlns:wp="http://schemas.openxmlformats.org/drawingml/2006/wordprocessingDrawing" xmlns:w10="urn:schemas-microsoft-com:office:word" xmlns:w="http://schemas.openxmlformats.org/wordprocessingml/2006/main" xmlns:w14="http://schemas.microsoft.com/office/word/2010/wordml" xmlns:w15="http://schemas.microsoft.com/office/word/2012/wordml" xmlns:w16cei="http://schemas.microsoft.com/office/word/2026/wordml/cei" xmlns:w16cex="http://schemas.microsoft.com/office/word/2018/wordml/cex" xmlns:w16cid="http://schemas.microsoft.com/office/word/2016/wordml/cid" xmlns:w16="http://schemas.microsoft.com/office/word/2018/wordml" xmlns:w16du="http://schemas.microsoft.com/office/word/2023/wordml/word16du" xmlns:w16sdtdh="http://schemas.microsoft.com/office/word/2020/wordml/sdtdatahash" xmlns:w16sdtfl="http://schemas.microsoft.com/office/word/2024/wordml/sdtformatlock" xmlns:w16se="http://schemas.microsoft.com/office/word/2015/wordml/symex" xmlns:wpg="http://schemas.microsoft.com/office/word/2010/wordprocessingGroup" xmlns:wpi="http://schemas.microsoft.com/office/word/2010/wordprocessingInk" xmlns:wne="http://schemas.microsoft.com/office/word/2006/wordml" xmlns:wps="http://schemas.microsoft.com/office/word/2010/wordprocessingShape" mc:Ignorable="w14 w15 w16se w16cid w16 w16cex w16sdtdh w16sdtfl w16du wp14">
+<w:footnotes xmlns:wpc="http://schemas.microsoft.com/office/word/2010/wordprocessingCanvas" xmlns:cx="http://schemas.microsoft.com/office/drawing/2014/chartex" xmlns:cx1="http://schemas.microsoft.com/office/drawing/2015/9/8/chartex" xmlns:cx2="http://schemas.microsoft.com/office/drawing/2015/10/21/chartex" xmlns:cx3="http://schemas.microsoft.com/office/drawing/2016/5/9/chartex" xmlns:cx4="http://schemas.microsoft.com/office/drawing/2016/5/10/chartex" xmlns:cx5="http://schemas.microsoft.com/office/drawing/2016/5/11/chartex" xmlns:cx6="http://schemas.microsoft.com/office/drawing/2016/5/12/chartex" xmlns:cx7="http://schemas.microsoft.com/office/drawing/2016/5/13/chartex" xmlns:cx8="http://schemas.microsoft.com/office/drawing/2016/5/14/chartex" xmlns:mc="http://schemas.openxmlformats.org/markup-compatibility/2006" xmlns:aink="http://schemas.microsoft.com/office/drawing/2016/ink" xmlns:am3d="http://schemas.microsoft.com/office/drawing/2017/model3d" xmlns:o="urn:schemas-microsoft-com:office:office" xmlns:oel="http://schemas.microsoft.com/office/2019/extlst" xmlns:r="http://schemas.openxmlformats.org/officeDocument/2006/relationships" xmlns:m="http://schemas.openxmlformats.org/officeDocument/2006/math" xmlns:v="urn:schemas-microsoft-com:vml" xmlns:wp14="http://schemas.microsoft.com/office/word/2010/wordprocessingDrawing" xmlns:wp="http://schemas.openxmlformats.org/drawingml/2006/wordprocessingDrawing" xmlns:w10="urn:schemas-microsoft-com:office:word" xmlns:w="http://schemas.openxmlformats.org/wordprocessingml/2006/main" xmlns:w14="http://schemas.microsoft.com/office/word/2010/wordml" xmlns:w15="http://schemas.microsoft.com/office/word/2012/wordml" xmlns:w16cex="http://schemas.microsoft.com/office/word/2018/wordml/cex" xmlns:w16cid="http://schemas.microsoft.com/office/word/2016/wordml/cid" xmlns:w16="http://schemas.microsoft.com/office/word/2018/wordml" xmlns:w16du="http://schemas.microsoft.com/office/word/2023/wordml/word16du" xmlns:w16sdtdh="http://schemas.microsoft.com/office/word/2020/wordml/sdtdatahash" xmlns:w16sdtfl="http://schemas.microsoft.com/office/word/2024/wordml/sdtformatlock" xmlns:w16se="http://schemas.microsoft.com/office/word/2015/wordml/symex" xmlns:wpg="http://schemas.microsoft.com/office/word/2010/wordprocessingGroup" xmlns:wpi="http://schemas.microsoft.com/office/word/2010/wordprocessingInk" xmlns:wne="http://schemas.microsoft.com/office/word/2006/wordml" xmlns:wps="http://schemas.microsoft.com/office/word/2010/wordprocessingShape" mc:Ignorable="w14 w15 w16se w16cid w16 w16cex w16sdtdh w16sdtfl w16du wp14">
   <w:footnote w:type="separator" w:id="-1">
     <w:p>
       <w:pPr>
@@ -8031,7 +8673,7 @@
 </file>
 
 <file path=word/header1.xml><?xml version="1.0" encoding="utf-8"?>
-<w:hdr xmlns:wpc="http://schemas.microsoft.com/office/word/2010/wordprocessingCanvas" xmlns:cx="http://schemas.microsoft.com/office/drawing/2014/chartex" xmlns:cx1="http://schemas.microsoft.com/office/drawing/2015/9/8/chartex" xmlns:cx2="http://schemas.microsoft.com/office/drawing/2015/10/21/chartex" xmlns:cx3="http://schemas.microsoft.com/office/drawing/2016/5/9/chartex" xmlns:cx4="http://schemas.microsoft.com/office/drawing/2016/5/10/chartex" xmlns:cx5="http://schemas.microsoft.com/office/drawing/2016/5/11/chartex" xmlns:cx6="http://schemas.microsoft.com/office/drawing/2016/5/12/chartex" xmlns:cx7="http://schemas.microsoft.com/office/drawing/2016/5/13/chartex" xmlns:cx8="http://schemas.microsoft.com/office/drawing/2016/5/14/chartex" xmlns:mc="http://schemas.openxmlformats.org/markup-compatibility/2006" xmlns:aink="http://schemas.microsoft.com/office/drawing/2016/ink" xmlns:am3d="http://schemas.microsoft.com/office/drawing/2017/model3d" xmlns:o="urn:schemas-microsoft-com:office:office" xmlns:oel="http://schemas.microsoft.com/office/2019/extlst" xmlns:r="http://schemas.openxmlformats.org/officeDocument/2006/relationships" xmlns:m="http://schemas.openxmlformats.org/officeDocument/2006/math" xmlns:v="urn:schemas-microsoft-com:vml" xmlns:wp14="http://schemas.microsoft.com/office/word/2010/wordprocessingDrawing" xmlns:wp="http://schemas.openxmlformats.org/drawingml/2006/wordprocessingDrawing" xmlns:w10="urn:schemas-microsoft-com:office:word" xmlns:w="http://schemas.openxmlformats.org/wordprocessingml/2006/main" xmlns:w14="http://schemas.microsoft.com/office/word/2010/wordml" xmlns:w15="http://schemas.microsoft.com/office/word/2012/wordml" xmlns:w16cei="http://schemas.microsoft.com/office/word/2026/wordml/cei" xmlns:w16cex="http://schemas.microsoft.com/office/word/2018/wordml/cex" xmlns:w16cid="http://schemas.microsoft.com/office/word/2016/wordml/cid" xmlns:w16="http://schemas.microsoft.com/office/word/2018/wordml" xmlns:w16du="http://schemas.microsoft.com/office/word/2023/wordml/word16du" xmlns:w16sdtdh="http://schemas.microsoft.com/office/word/2020/wordml/sdtdatahash" xmlns:w16sdtfl="http://schemas.microsoft.com/office/word/2024/wordml/sdtformatlock" xmlns:w16se="http://schemas.microsoft.com/office/word/2015/wordml/symex" xmlns:wpg="http://schemas.microsoft.com/office/word/2010/wordprocessingGroup" xmlns:wpi="http://schemas.microsoft.com/office/word/2010/wordprocessingInk" xmlns:wne="http://schemas.microsoft.com/office/word/2006/wordml" xmlns:wps="http://schemas.microsoft.com/office/word/2010/wordprocessingShape" mc:Ignorable="w14 w15 w16se w16cid w16 w16cex w16sdtdh w16sdtfl w16du wp14">
+<w:hdr xmlns:wpc="http://schemas.microsoft.com/office/word/2010/wordprocessingCanvas" xmlns:cx="http://schemas.microsoft.com/office/drawing/2014/chartex" xmlns:cx1="http://schemas.microsoft.com/office/drawing/2015/9/8/chartex" xmlns:cx2="http://schemas.microsoft.com/office/drawing/2015/10/21/chartex" xmlns:cx3="http://schemas.microsoft.com/office/drawing/2016/5/9/chartex" xmlns:cx4="http://schemas.microsoft.com/office/drawing/2016/5/10/chartex" xmlns:cx5="http://schemas.microsoft.com/office/drawing/2016/5/11/chartex" xmlns:cx6="http://schemas.microsoft.com/office/drawing/2016/5/12/chartex" xmlns:cx7="http://schemas.microsoft.com/office/drawing/2016/5/13/chartex" xmlns:cx8="http://schemas.microsoft.com/office/drawing/2016/5/14/chartex" xmlns:mc="http://schemas.openxmlformats.org/markup-compatibility/2006" xmlns:aink="http://schemas.microsoft.com/office/drawing/2016/ink" xmlns:am3d="http://schemas.microsoft.com/office/drawing/2017/model3d" xmlns:o="urn:schemas-microsoft-com:office:office" xmlns:oel="http://schemas.microsoft.com/office/2019/extlst" xmlns:r="http://schemas.openxmlformats.org/officeDocument/2006/relationships" xmlns:m="http://schemas.openxmlformats.org/officeDocument/2006/math" xmlns:v="urn:schemas-microsoft-com:vml" xmlns:wp14="http://schemas.microsoft.com/office/word/2010/wordprocessingDrawing" xmlns:wp="http://schemas.openxmlformats.org/drawingml/2006/wordprocessingDrawing" xmlns:w10="urn:schemas-microsoft-com:office:word" xmlns:w="http://schemas.openxmlformats.org/wordprocessingml/2006/main" xmlns:w14="http://schemas.microsoft.com/office/word/2010/wordml" xmlns:w15="http://schemas.microsoft.com/office/word/2012/wordml" xmlns:w16cex="http://schemas.microsoft.com/office/word/2018/wordml/cex" xmlns:w16cid="http://schemas.microsoft.com/office/word/2016/wordml/cid" xmlns:w16="http://schemas.microsoft.com/office/word/2018/wordml" xmlns:w16du="http://schemas.microsoft.com/office/word/2023/wordml/word16du" xmlns:w16sdtdh="http://schemas.microsoft.com/office/word/2020/wordml/sdtdatahash" xmlns:w16sdtfl="http://schemas.microsoft.com/office/word/2024/wordml/sdtformatlock" xmlns:w16se="http://schemas.microsoft.com/office/word/2015/wordml/symex" xmlns:wpg="http://schemas.microsoft.com/office/word/2010/wordprocessingGroup" xmlns:wpi="http://schemas.microsoft.com/office/word/2010/wordprocessingInk" xmlns:wne="http://schemas.microsoft.com/office/word/2006/wordml" xmlns:wps="http://schemas.microsoft.com/office/word/2010/wordprocessingShape" mc:Ignorable="w14 w15 w16se w16cid w16 w16cex w16sdtdh w16sdtfl w16du wp14">
   <w:p>
     <w:pPr>
       <w:pStyle w:val="Header"/>
@@ -8041,7 +8683,7 @@
 </file>
 
 <file path=word/numbering.xml><?xml version="1.0" encoding="utf-8"?>
-<w:numbering xmlns:wpc="http://schemas.microsoft.com/office/word/2010/wordprocessingCanvas" xmlns:cx="http://schemas.microsoft.com/office/drawing/2014/chartex" xmlns:cx1="http://schemas.microsoft.com/office/drawing/2015/9/8/chartex" xmlns:cx2="http://schemas.microsoft.com/office/drawing/2015/10/21/chartex" xmlns:cx3="http://schemas.microsoft.com/office/drawing/2016/5/9/chartex" xmlns:cx4="http://schemas.microsoft.com/office/drawing/2016/5/10/chartex" xmlns:cx5="http://schemas.microsoft.com/office/drawing/2016/5/11/chartex" xmlns:cx6="http://schemas.microsoft.com/office/drawing/2016/5/12/chartex" xmlns:cx7="http://schemas.microsoft.com/office/drawing/2016/5/13/chartex" xmlns:cx8="http://schemas.microsoft.com/office/drawing/2016/5/14/chartex" xmlns:mc="http://schemas.openxmlformats.org/markup-compatibility/2006" xmlns:aink="http://schemas.microsoft.com/office/drawing/2016/ink" xmlns:am3d="http://schemas.microsoft.com/office/drawing/2017/model3d" xmlns:o="urn:schemas-microsoft-com:office:office" xmlns:oel="http://schemas.microsoft.com/office/2019/extlst" xmlns:r="http://schemas.openxmlformats.org/officeDocument/2006/relationships" xmlns:m="http://schemas.openxmlformats.org/officeDocument/2006/math" xmlns:v="urn:schemas-microsoft-com:vml" xmlns:wp14="http://schemas.microsoft.com/office/word/2010/wordprocessingDrawing" xmlns:wp="http://schemas.openxmlformats.org/drawingml/2006/wordprocessingDrawing" xmlns:w10="urn:schemas-microsoft-com:office:word" xmlns:w="http://schemas.openxmlformats.org/wordprocessingml/2006/main" xmlns:w14="http://schemas.microsoft.com/office/word/2010/wordml" xmlns:w15="http://schemas.microsoft.com/office/word/2012/wordml" xmlns:w16cei="http://schemas.microsoft.com/office/word/2026/wordml/cei" xmlns:w16cex="http://schemas.microsoft.com/office/word/2018/wordml/cex" xmlns:w16cid="http://schemas.microsoft.com/office/word/2016/wordml/cid" xmlns:w16="http://schemas.microsoft.com/office/word/2018/wordml" xmlns:w16du="http://schemas.microsoft.com/office/word/2023/wordml/word16du" xmlns:w16sdtdh="http://schemas.microsoft.com/office/word/2020/wordml/sdtdatahash" xmlns:w16sdtfl="http://schemas.microsoft.com/office/word/2024/wordml/sdtformatlock" xmlns:w16se="http://schemas.microsoft.com/office/word/2015/wordml/symex" xmlns:wpg="http://schemas.microsoft.com/office/word/2010/wordprocessingGroup" xmlns:wpi="http://schemas.microsoft.com/office/word/2010/wordprocessingInk" xmlns:wne="http://schemas.microsoft.com/office/word/2006/wordml" xmlns:wps="http://schemas.microsoft.com/office/word/2010/wordprocessingShape" mc:Ignorable="w14 w15 w16se w16cid w16 w16cex w16sdtdh w16sdtfl w16du wp14">
+<w:numbering xmlns:wpc="http://schemas.microsoft.com/office/word/2010/wordprocessingCanvas" xmlns:cx="http://schemas.microsoft.com/office/drawing/2014/chartex" xmlns:cx1="http://schemas.microsoft.com/office/drawing/2015/9/8/chartex" xmlns:cx2="http://schemas.microsoft.com/office/drawing/2015/10/21/chartex" xmlns:cx3="http://schemas.microsoft.com/office/drawing/2016/5/9/chartex" xmlns:cx4="http://schemas.microsoft.com/office/drawing/2016/5/10/chartex" xmlns:cx5="http://schemas.microsoft.com/office/drawing/2016/5/11/chartex" xmlns:cx6="http://schemas.microsoft.com/office/drawing/2016/5/12/chartex" xmlns:cx7="http://schemas.microsoft.com/office/drawing/2016/5/13/chartex" xmlns:cx8="http://schemas.microsoft.com/office/drawing/2016/5/14/chartex" xmlns:mc="http://schemas.openxmlformats.org/markup-compatibility/2006" xmlns:aink="http://schemas.microsoft.com/office/drawing/2016/ink" xmlns:am3d="http://schemas.microsoft.com/office/drawing/2017/model3d" xmlns:o="urn:schemas-microsoft-com:office:office" xmlns:oel="http://schemas.microsoft.com/office/2019/extlst" xmlns:r="http://schemas.openxmlformats.org/officeDocument/2006/relationships" xmlns:m="http://schemas.openxmlformats.org/officeDocument/2006/math" xmlns:v="urn:schemas-microsoft-com:vml" xmlns:wp14="http://schemas.microsoft.com/office/word/2010/wordprocessingDrawing" xmlns:wp="http://schemas.openxmlformats.org/drawingml/2006/wordprocessingDrawing" xmlns:w10="urn:schemas-microsoft-com:office:word" xmlns:w="http://schemas.openxmlformats.org/wordprocessingml/2006/main" xmlns:w14="http://schemas.microsoft.com/office/word/2010/wordml" xmlns:w15="http://schemas.microsoft.com/office/word/2012/wordml" xmlns:w16cex="http://schemas.microsoft.com/office/word/2018/wordml/cex" xmlns:w16cid="http://schemas.microsoft.com/office/word/2016/wordml/cid" xmlns:w16="http://schemas.microsoft.com/office/word/2018/wordml" xmlns:w16du="http://schemas.microsoft.com/office/word/2023/wordml/word16du" xmlns:w16sdtdh="http://schemas.microsoft.com/office/word/2020/wordml/sdtdatahash" xmlns:w16sdtfl="http://schemas.microsoft.com/office/word/2024/wordml/sdtformatlock" xmlns:w16se="http://schemas.microsoft.com/office/word/2015/wordml/symex" xmlns:wpg="http://schemas.microsoft.com/office/word/2010/wordprocessingGroup" xmlns:wpi="http://schemas.microsoft.com/office/word/2010/wordprocessingInk" xmlns:wne="http://schemas.microsoft.com/office/word/2006/wordml" xmlns:wps="http://schemas.microsoft.com/office/word/2010/wordprocessingShape" mc:Ignorable="w14 w15 w16se w16cid w16 w16cex w16sdtdh w16sdtfl w16du wp14">
   <w:abstractNum w:abstractNumId="0" w15:restartNumberingAfterBreak="0">
     <w:nsid w:val="FFFFFF7C"/>
     <w:multiLevelType w:val="singleLevel"/>

</xml_diff>